<commit_message>
Finished task 3 as well use case diagram
I finished the use case diagram , at least the first iteration of it. I have also written the five use case descriptions using the templates provided in the lecture slides.
</commit_message>
<xml_diff>
--- a/Progress Report.docx
+++ b/Progress Report.docx
@@ -4095,7 +4095,15 @@
         <w:t>cancellations</w:t>
       </w:r>
       <w:r>
-        <w:t xml:space="preserve"> are not present in the system they have to be manually fed through </w:t>
+        <w:t xml:space="preserve"> are not present in the system they </w:t>
+      </w:r>
+      <w:proofErr w:type="gramStart"/>
+      <w:r>
+        <w:t>have to</w:t>
+      </w:r>
+      <w:proofErr w:type="gramEnd"/>
+      <w:r>
+        <w:t xml:space="preserve"> be manually fed through </w:t>
       </w:r>
     </w:p>
     <w:p>
@@ -4385,7 +4393,15 @@
         <w:t>proof</w:t>
       </w:r>
       <w:r>
-        <w:t xml:space="preserve"> of delivery and also any incident notes</w:t>
+        <w:t xml:space="preserve"> of delivery </w:t>
+      </w:r>
+      <w:proofErr w:type="gramStart"/>
+      <w:r>
+        <w:t>and also</w:t>
+      </w:r>
+      <w:proofErr w:type="gramEnd"/>
+      <w:r>
+        <w:t xml:space="preserve"> any incident notes</w:t>
       </w:r>
     </w:p>
     <w:p>
@@ -4408,13 +4424,29 @@
         </w:numPr>
       </w:pPr>
       <w:r>
-        <w:t xml:space="preserve">I have to manually update the </w:t>
+        <w:t xml:space="preserve">I </w:t>
+      </w:r>
+      <w:proofErr w:type="gramStart"/>
+      <w:r>
+        <w:t>have to</w:t>
+      </w:r>
+      <w:proofErr w:type="gramEnd"/>
+      <w:r>
+        <w:t xml:space="preserve"> manually update the </w:t>
       </w:r>
       <w:r>
         <w:t>shipment</w:t>
       </w:r>
       <w:r>
-        <w:t xml:space="preserve"> status that is given by the driver , the delays and suspensions , the route changes I have to manually change , </w:t>
+        <w:t xml:space="preserve"> status that is given by the driver , the delays and suspensions , the route changes I </w:t>
+      </w:r>
+      <w:proofErr w:type="gramStart"/>
+      <w:r>
+        <w:t>have to</w:t>
+      </w:r>
+      <w:proofErr w:type="gramEnd"/>
+      <w:r>
+        <w:t xml:space="preserve"> manually change , </w:t>
       </w:r>
       <w:r>
         <w:t>failed</w:t>
@@ -4479,11 +4511,16 @@
         <w:t>to</w:t>
       </w:r>
       <w:r>
-        <w:t xml:space="preserve"> the drivers and </w:t>
+        <w:t xml:space="preserve"> the drivers </w:t>
+      </w:r>
+      <w:proofErr w:type="gramStart"/>
+      <w:r>
+        <w:t xml:space="preserve">and </w:t>
       </w:r>
       <w:r>
         <w:t>also</w:t>
       </w:r>
+      <w:proofErr w:type="gramEnd"/>
       <w:r>
         <w:t xml:space="preserve"> their manager , they </w:t>
       </w:r>
@@ -4909,10 +4946,24 @@
     </w:p>
     <w:p/>
     <w:p>
-      <w:r>
+      <w:pPr>
+        <w:rPr>
+          <w:b/>
+          <w:bCs/>
+        </w:rPr>
+      </w:pPr>
+      <w:r>
+        <w:rPr>
+          <w:b/>
+          <w:bCs/>
+        </w:rPr>
         <w:t xml:space="preserve">Identify </w:t>
       </w:r>
       <w:r>
+        <w:rPr>
+          <w:b/>
+          <w:bCs/>
+        </w:rPr>
         <w:t>Stakeholders</w:t>
       </w:r>
     </w:p>
@@ -5085,7 +5136,17 @@
     </w:p>
     <w:p/>
     <w:p>
-      <w:r>
+      <w:pPr>
+        <w:rPr>
+          <w:b/>
+          <w:bCs/>
+        </w:rPr>
+      </w:pPr>
+      <w:r>
+        <w:rPr>
+          <w:b/>
+          <w:bCs/>
+        </w:rPr>
         <w:t>Understand Business goals</w:t>
       </w:r>
     </w:p>
@@ -6835,10 +6896,7 @@
         </w:numPr>
       </w:pPr>
       <w:r>
-        <w:t xml:space="preserve">Customers </w:t>
-      </w:r>
-      <w:r>
-        <w:t>require the system to track shipments and view shipment status</w:t>
+        <w:t>Customers require the system to track shipments and view shipment status</w:t>
       </w:r>
     </w:p>
     <w:p>
@@ -7028,85 +7086,2602 @@
         <w:t>requirement</w:t>
       </w:r>
       <w:r>
+        <w:t xml:space="preserve">) : The system shall gene reports </w:t>
+      </w:r>
+      <w:r>
+        <w:t>of</w:t>
+      </w:r>
+      <w:r>
+        <w:t xml:space="preserve"> the </w:t>
+      </w:r>
+      <w:r>
+        <w:t>shipments</w:t>
+      </w:r>
+      <w:r>
+        <w:t xml:space="preserve"> and operational information.</w:t>
+      </w:r>
+    </w:p>
+    <w:p/>
+    <w:p>
+      <w:r>
+        <w:t>IT Administrators</w:t>
+      </w:r>
+    </w:p>
+    <w:p>
+      <w:pPr>
+        <w:pStyle w:val="ListParagraph"/>
+        <w:numPr>
+          <w:ilvl w:val="0"/>
+          <w:numId w:val="1"/>
+        </w:numPr>
+      </w:pPr>
+      <w:r>
+        <w:t xml:space="preserve">IT </w:t>
+      </w:r>
+      <w:r>
+        <w:t>administrators</w:t>
+      </w:r>
+      <w:r>
+        <w:t xml:space="preserve"> require the system to manage user access and maintain system performance</w:t>
+      </w:r>
+      <w:r>
+        <w:t>.</w:t>
+      </w:r>
+    </w:p>
+    <w:p>
+      <w:pPr>
+        <w:pStyle w:val="ListParagraph"/>
+        <w:numPr>
+          <w:ilvl w:val="0"/>
+          <w:numId w:val="1"/>
+        </w:numPr>
+      </w:pPr>
+      <w:r>
+        <w:t xml:space="preserve">(Functional </w:t>
+      </w:r>
+      <w:r>
+        <w:t>requirement</w:t>
+      </w:r>
+      <w:r>
         <w:t>) :</w:t>
       </w:r>
       <w:r>
-        <w:t xml:space="preserve"> The system shall gene reports </w:t>
+        <w:t xml:space="preserve">The system shall mange user roles, enforce access control, and maintain system </w:t>
+      </w:r>
+      <w:r>
+        <w:t>performance</w:t>
+      </w:r>
+    </w:p>
+    <w:p/>
+    <w:p/>
+    <w:p>
+      <w:r>
+        <w:t>Task 3</w:t>
+      </w:r>
+    </w:p>
+    <w:p/>
+    <w:p>
+      <w:r>
+        <w:t>UML Requir</w:t>
+      </w:r>
+      <w:r>
+        <w:t>ements Modelling</w:t>
+      </w:r>
+    </w:p>
+    <w:p/>
+    <w:p>
+      <w:pPr>
+        <w:rPr>
+          <w:b/>
+          <w:bCs/>
+        </w:rPr>
+      </w:pPr>
+      <w:r>
+        <w:rPr>
+          <w:b/>
+          <w:bCs/>
+        </w:rPr>
+        <w:t xml:space="preserve">3.1 </w:t>
+      </w:r>
+      <w:r>
+        <w:rPr>
+          <w:b/>
+          <w:bCs/>
+        </w:rPr>
+        <w:t>Introduction</w:t>
+      </w:r>
+      <w:r>
+        <w:rPr>
+          <w:b/>
+          <w:bCs/>
+        </w:rPr>
+        <w:t>:</w:t>
+      </w:r>
+    </w:p>
+    <w:p>
+      <w:r>
+        <w:t xml:space="preserve">The UML </w:t>
+      </w:r>
+      <w:r>
+        <w:t>requirements</w:t>
+      </w:r>
+      <w:r>
+        <w:t xml:space="preserve"> Modelling contains the use case modelling for </w:t>
+      </w:r>
+      <w:r>
+        <w:t>the</w:t>
+      </w:r>
+      <w:r>
+        <w:t xml:space="preserve"> </w:t>
+      </w:r>
+      <w:r>
+        <w:t>Mainfreight</w:t>
+      </w:r>
+      <w:r>
+        <w:t xml:space="preserve"> logistics </w:t>
+      </w:r>
+      <w:r>
+        <w:t>management</w:t>
+      </w:r>
+      <w:r>
+        <w:t xml:space="preserve"> system. The purpose of the USE case model is to be a</w:t>
+      </w:r>
+      <w:r>
+        <w:t>b</w:t>
+      </w:r>
+      <w:r>
+        <w:t>l</w:t>
+      </w:r>
+      <w:r>
+        <w:t>e</w:t>
+      </w:r>
+      <w:r>
+        <w:t xml:space="preserve"> </w:t>
+      </w:r>
+      <w:r>
+        <w:t>t</w:t>
+      </w:r>
+      <w:r>
+        <w:t xml:space="preserve">o </w:t>
+      </w:r>
+      <w:r>
+        <w:t>represent</w:t>
+      </w:r>
+      <w:r>
+        <w:t xml:space="preserve"> the </w:t>
+      </w:r>
+      <w:r>
+        <w:t>functional</w:t>
+      </w:r>
+      <w:r>
+        <w:t xml:space="preserve"> </w:t>
+      </w:r>
+      <w:r>
+        <w:t>behaviour</w:t>
+      </w:r>
+      <w:r>
+        <w:t xml:space="preserve"> of the system and how different stakeholder will be </w:t>
+      </w:r>
+      <w:r>
+        <w:t>able</w:t>
+      </w:r>
+      <w:r>
+        <w:t xml:space="preserve"> to interact with it. </w:t>
+      </w:r>
+    </w:p>
+    <w:p>
+      <w:r>
+        <w:t xml:space="preserve">A use case model is used to model the functionality of the system form the user’s </w:t>
+      </w:r>
+      <w:r>
+        <w:t>perceptive</w:t>
+      </w:r>
+      <w:r>
+        <w:t xml:space="preserve"> and </w:t>
+      </w:r>
+      <w:r>
+        <w:t>how the system adds value to the different actors present in the use case modelling.</w:t>
+      </w:r>
+    </w:p>
+    <w:p>
+      <w:r>
+        <w:t>The actors are the stakeholders and users that were derived from task 1 and task 2.</w:t>
+      </w:r>
+    </w:p>
+    <w:p>
+      <w:r>
+        <w:t>System overview</w:t>
+      </w:r>
+      <w:r>
+        <w:t>:</w:t>
+      </w:r>
+    </w:p>
+    <w:p>
+      <w:r>
+        <w:t xml:space="preserve">The proposed system is the solution that we plan to </w:t>
+      </w:r>
+      <w:r>
+        <w:t>implement</w:t>
+      </w:r>
+      <w:r>
+        <w:t xml:space="preserve"> for the client. </w:t>
+      </w:r>
+      <w:r>
+        <w:t xml:space="preserve">This </w:t>
+      </w:r>
+      <w:r>
+        <w:t>system</w:t>
+      </w:r>
+      <w:r>
+        <w:t xml:space="preserve"> is </w:t>
+      </w:r>
+      <w:r>
+        <w:t>designed</w:t>
+      </w:r>
+      <w:r>
+        <w:t xml:space="preserve"> to improve the coordination and communication across the </w:t>
+      </w:r>
+      <w:r>
+        <w:t>departments</w:t>
+      </w:r>
+      <w:r>
+        <w:t xml:space="preserve"> </w:t>
+      </w:r>
+      <w:r>
+        <w:t>within</w:t>
+      </w:r>
+      <w:r>
+        <w:t xml:space="preserve"> </w:t>
+      </w:r>
+      <w:r>
+        <w:t>Mainfreight</w:t>
+      </w:r>
+      <w:r>
+        <w:t xml:space="preserve"> such as transport operations, warehousing services, customer services, air &amp; ocean freight, and IT.</w:t>
+      </w:r>
+    </w:p>
+    <w:p>
+      <w:r>
+        <w:t xml:space="preserve">They </w:t>
+      </w:r>
+      <w:r>
+        <w:t>currently</w:t>
+      </w:r>
+      <w:r>
+        <w:t xml:space="preserve"> rely on manual communication such as emails , and other social media platforms to send fragmented </w:t>
+      </w:r>
+      <w:r>
+        <w:t>pieces</w:t>
+      </w:r>
+      <w:r>
+        <w:t xml:space="preserve"> of information . They cannot keep track of everything in one place.</w:t>
+      </w:r>
+    </w:p>
+    <w:p>
+      <w:r>
+        <w:t xml:space="preserve">The use </w:t>
+      </w:r>
+      <w:r>
+        <w:t>c</w:t>
+      </w:r>
+      <w:r>
+        <w:t xml:space="preserve">ase diagram </w:t>
+      </w:r>
+      <w:r>
+        <w:t>represents</w:t>
+      </w:r>
+      <w:r>
+        <w:t xml:space="preserve"> the functionalities </w:t>
       </w:r>
       <w:r>
         <w:t>of</w:t>
       </w:r>
       <w:r>
+        <w:t xml:space="preserve"> the system </w:t>
+      </w:r>
+      <w:r>
+        <w:t xml:space="preserve">at a higher </w:t>
+      </w:r>
+      <w:r>
+        <w:t>level,</w:t>
+      </w:r>
+      <w:r>
+        <w:t xml:space="preserve"> and it </w:t>
+      </w:r>
+      <w:r>
+        <w:t>defines</w:t>
+      </w:r>
+      <w:r>
+        <w:t xml:space="preserve"> how the users interact with the system to be able to achieve the client goals</w:t>
+      </w:r>
+      <w:r>
+        <w:t>.</w:t>
+      </w:r>
+    </w:p>
+    <w:p>
+      <w:pPr>
+        <w:rPr>
+          <w:b/>
+          <w:bCs/>
+        </w:rPr>
+      </w:pPr>
+      <w:r>
+        <w:rPr>
+          <w:b/>
+          <w:bCs/>
+        </w:rPr>
+        <w:lastRenderedPageBreak/>
+        <w:t xml:space="preserve">3.2 </w:t>
+      </w:r>
+      <w:r>
+        <w:rPr>
+          <w:b/>
+          <w:bCs/>
+        </w:rPr>
+        <w:t>Use Case Diagram:</w:t>
+      </w:r>
+    </w:p>
+    <w:p>
+      <w:r>
+        <w:rPr>
+          <w:noProof/>
+        </w:rPr>
+        <w:drawing>
+          <wp:inline distT="0" distB="0" distL="0" distR="0" wp14:anchorId="6E0700E3" wp14:editId="429CE84A">
+            <wp:extent cx="5731510" cy="3020060"/>
+            <wp:effectExtent l="0" t="0" r="2540" b="8890"/>
+            <wp:docPr id="1567784928" name="Picture 1"/>
+            <wp:cNvGraphicFramePr>
+              <a:graphicFrameLocks xmlns:a="http://schemas.openxmlformats.org/drawingml/2006/main" noChangeAspect="1"/>
+            </wp:cNvGraphicFramePr>
+            <a:graphic xmlns:a="http://schemas.openxmlformats.org/drawingml/2006/main">
+              <a:graphicData uri="http://schemas.openxmlformats.org/drawingml/2006/picture">
+                <pic:pic xmlns:pic="http://schemas.openxmlformats.org/drawingml/2006/picture">
+                  <pic:nvPicPr>
+                    <pic:cNvPr id="1567784928" name="Picture 1567784928"/>
+                    <pic:cNvPicPr/>
+                  </pic:nvPicPr>
+                  <pic:blipFill>
+                    <a:blip r:embed="rId7">
+                      <a:extLst>
+                        <a:ext uri="{28A0092B-C50C-407E-A947-70E740481C1C}">
+                          <a14:useLocalDpi xmlns:a14="http://schemas.microsoft.com/office/drawing/2010/main" val="0"/>
+                        </a:ext>
+                      </a:extLst>
+                    </a:blip>
+                    <a:stretch>
+                      <a:fillRect/>
+                    </a:stretch>
+                  </pic:blipFill>
+                  <pic:spPr>
+                    <a:xfrm>
+                      <a:off x="0" y="0"/>
+                      <a:ext cx="5745079" cy="3027210"/>
+                    </a:xfrm>
+                    <a:prstGeom prst="rect">
+                      <a:avLst/>
+                    </a:prstGeom>
+                  </pic:spPr>
+                </pic:pic>
+              </a:graphicData>
+            </a:graphic>
+          </wp:inline>
+        </w:drawing>
+      </w:r>
+    </w:p>
+    <w:p>
+      <w:r>
+        <w:t xml:space="preserve">The diagram </w:t>
+      </w:r>
+      <w:r>
+        <w:t>above</w:t>
+      </w:r>
+      <w:r>
+        <w:t xml:space="preserve"> shows the system boundary and the interaction between actors and system </w:t>
+      </w:r>
+      <w:r>
+        <w:t>functionalities</w:t>
+      </w:r>
+      <w:r>
+        <w:t xml:space="preserve">. It shows how the customers, staff, and </w:t>
+      </w:r>
+      <w:r>
+        <w:t>administrators</w:t>
+      </w:r>
+      <w:r>
+        <w:t xml:space="preserve"> interact with core operation like </w:t>
+      </w:r>
+      <w:r>
+        <w:t>shipment</w:t>
+      </w:r>
+      <w:r>
+        <w:t xml:space="preserve"> tracking , updating  shipment status, managing </w:t>
+      </w:r>
+      <w:r>
+        <w:t>inventory</w:t>
+      </w:r>
+      <w:r>
+        <w:t xml:space="preserve">, and handling customer </w:t>
+      </w:r>
+      <w:r>
+        <w:t>enquiries</w:t>
+      </w:r>
+      <w:r>
+        <w:t>.</w:t>
+      </w:r>
+    </w:p>
+    <w:p/>
+    <w:p>
+      <w:pPr>
+        <w:rPr>
+          <w:b/>
+          <w:bCs/>
+        </w:rPr>
+      </w:pPr>
+      <w:r>
+        <w:rPr>
+          <w:b/>
+          <w:bCs/>
+        </w:rPr>
+        <w:t xml:space="preserve">3.3 </w:t>
+      </w:r>
+      <w:r>
+        <w:rPr>
+          <w:b/>
+          <w:bCs/>
+        </w:rPr>
+        <w:t>Identification of actors:</w:t>
+      </w:r>
+    </w:p>
+    <w:p>
+      <w:r>
+        <w:t xml:space="preserve">Actors represent the </w:t>
+      </w:r>
+      <w:r>
+        <w:t>external</w:t>
+      </w:r>
+      <w:r>
+        <w:t xml:space="preserve"> objects that interact with the system. </w:t>
+      </w:r>
+      <w:r>
+        <w:t>Actors</w:t>
+      </w:r>
+      <w:r>
+        <w:t xml:space="preserve"> can be defined as the users of the system who can be human or external system that are performing specific roles</w:t>
+      </w:r>
+    </w:p>
+    <w:p>
+      <w:r>
+        <w:t xml:space="preserve">The </w:t>
+      </w:r>
+      <w:r>
+        <w:t>actors</w:t>
+      </w:r>
+      <w:r>
+        <w:t xml:space="preserve"> </w:t>
+      </w:r>
+      <w:r>
+        <w:t>identify</w:t>
+      </w:r>
+      <w:r>
+        <w:t xml:space="preserve"> for this system were derived from the stakeholder analysis in task 1 and task 2:</w:t>
+      </w:r>
+    </w:p>
+    <w:p>
+      <w:pPr>
+        <w:pStyle w:val="ListParagraph"/>
+        <w:numPr>
+          <w:ilvl w:val="0"/>
+          <w:numId w:val="1"/>
+        </w:numPr>
+      </w:pPr>
+      <w:r>
+        <w:t>Customer</w:t>
+      </w:r>
+    </w:p>
+    <w:p>
+      <w:pPr>
+        <w:pStyle w:val="ListParagraph"/>
+        <w:numPr>
+          <w:ilvl w:val="0"/>
+          <w:numId w:val="1"/>
+        </w:numPr>
+      </w:pPr>
+      <w:r>
+        <w:t>Customer service staff</w:t>
+      </w:r>
+    </w:p>
+    <w:p>
+      <w:pPr>
+        <w:pStyle w:val="ListParagraph"/>
+        <w:numPr>
+          <w:ilvl w:val="0"/>
+          <w:numId w:val="1"/>
+        </w:numPr>
+      </w:pPr>
+      <w:r>
+        <w:t>Transport staff</w:t>
+      </w:r>
+    </w:p>
+    <w:p>
+      <w:pPr>
+        <w:pStyle w:val="ListParagraph"/>
+        <w:numPr>
+          <w:ilvl w:val="0"/>
+          <w:numId w:val="1"/>
+        </w:numPr>
+      </w:pPr>
+      <w:r>
+        <w:t>Warehouse staff</w:t>
+      </w:r>
+    </w:p>
+    <w:p>
+      <w:pPr>
+        <w:pStyle w:val="ListParagraph"/>
+        <w:numPr>
+          <w:ilvl w:val="0"/>
+          <w:numId w:val="1"/>
+        </w:numPr>
+      </w:pPr>
+      <w:r>
+        <w:t xml:space="preserve">Admin ( IT </w:t>
+      </w:r>
+      <w:r>
+        <w:t>administrators</w:t>
+      </w:r>
+      <w:r>
+        <w:t>)</w:t>
+      </w:r>
+    </w:p>
+    <w:p/>
+    <w:p>
+      <w:pPr>
+        <w:rPr>
+          <w:b/>
+          <w:bCs/>
+        </w:rPr>
+      </w:pPr>
+      <w:r>
+        <w:rPr>
+          <w:b/>
+          <w:bCs/>
+        </w:rPr>
+        <w:t xml:space="preserve">3.4 </w:t>
+      </w:r>
+      <w:r>
+        <w:rPr>
+          <w:b/>
+          <w:bCs/>
+        </w:rPr>
+        <w:t>Identification</w:t>
+      </w:r>
+      <w:r>
+        <w:rPr>
+          <w:b/>
+          <w:bCs/>
+        </w:rPr>
+        <w:t xml:space="preserve"> of use cases</w:t>
+      </w:r>
+      <w:r>
+        <w:rPr>
+          <w:b/>
+          <w:bCs/>
+        </w:rPr>
+        <w:t>:</w:t>
+      </w:r>
+    </w:p>
+    <w:p>
+      <w:r>
+        <w:t xml:space="preserve">Use cases define and </w:t>
+      </w:r>
+      <w:r>
+        <w:t>represent</w:t>
+      </w:r>
+      <w:r>
+        <w:t xml:space="preserve"> he functional actions that the system performs for actors. For a sue case to be valid they must be:</w:t>
+      </w:r>
+    </w:p>
+    <w:p>
+      <w:pPr>
+        <w:pStyle w:val="ListParagraph"/>
+        <w:numPr>
+          <w:ilvl w:val="0"/>
+          <w:numId w:val="1"/>
+        </w:numPr>
+      </w:pPr>
+      <w:r>
+        <w:lastRenderedPageBreak/>
+        <w:t>Initiated by an actors</w:t>
+      </w:r>
+    </w:p>
+    <w:p>
+      <w:pPr>
+        <w:pStyle w:val="ListParagraph"/>
+        <w:numPr>
+          <w:ilvl w:val="0"/>
+          <w:numId w:val="1"/>
+        </w:numPr>
+      </w:pPr>
+      <w:r>
+        <w:t>Provide value</w:t>
+      </w:r>
+    </w:p>
+    <w:p>
+      <w:pPr>
+        <w:pStyle w:val="ListParagraph"/>
+        <w:numPr>
+          <w:ilvl w:val="0"/>
+          <w:numId w:val="1"/>
+        </w:numPr>
+      </w:pPr>
+      <w:r>
+        <w:t>Represent a complete interaction</w:t>
+      </w:r>
+    </w:p>
+    <w:p>
+      <w:r>
+        <w:t>The main use cases that were identified for this system were:</w:t>
+      </w:r>
+    </w:p>
+    <w:p>
+      <w:pPr>
+        <w:pStyle w:val="ListParagraph"/>
+        <w:numPr>
+          <w:ilvl w:val="0"/>
+          <w:numId w:val="1"/>
+        </w:numPr>
+      </w:pPr>
+      <w:r>
+        <w:t xml:space="preserve">Track </w:t>
+      </w:r>
+      <w:r>
+        <w:t>shipment</w:t>
+      </w:r>
+    </w:p>
+    <w:p>
+      <w:pPr>
+        <w:pStyle w:val="ListParagraph"/>
+        <w:numPr>
+          <w:ilvl w:val="0"/>
+          <w:numId w:val="1"/>
+        </w:numPr>
+      </w:pPr>
+      <w:r>
+        <w:t>View shipment information</w:t>
+      </w:r>
+    </w:p>
+    <w:p>
+      <w:pPr>
+        <w:pStyle w:val="ListParagraph"/>
+        <w:numPr>
+          <w:ilvl w:val="0"/>
+          <w:numId w:val="1"/>
+        </w:numPr>
+      </w:pPr>
+      <w:r>
+        <w:t>Handle customer enquiry</w:t>
+      </w:r>
+    </w:p>
+    <w:p>
+      <w:pPr>
+        <w:pStyle w:val="ListParagraph"/>
+        <w:numPr>
+          <w:ilvl w:val="0"/>
+          <w:numId w:val="1"/>
+        </w:numPr>
+      </w:pPr>
+      <w:r>
+        <w:t>Update shipment status</w:t>
+      </w:r>
+    </w:p>
+    <w:p>
+      <w:pPr>
+        <w:pStyle w:val="ListParagraph"/>
+        <w:numPr>
+          <w:ilvl w:val="0"/>
+          <w:numId w:val="1"/>
+        </w:numPr>
+      </w:pPr>
+      <w:r>
+        <w:t>Manage inventory</w:t>
+      </w:r>
+    </w:p>
+    <w:p>
+      <w:pPr>
+        <w:pStyle w:val="ListParagraph"/>
+        <w:numPr>
+          <w:ilvl w:val="0"/>
+          <w:numId w:val="1"/>
+        </w:numPr>
+      </w:pPr>
+      <w:r>
+        <w:t>Process returned goods</w:t>
+      </w:r>
+    </w:p>
+    <w:p>
+      <w:pPr>
+        <w:pStyle w:val="ListParagraph"/>
+        <w:numPr>
+          <w:ilvl w:val="0"/>
+          <w:numId w:val="1"/>
+        </w:numPr>
+      </w:pPr>
+      <w:r>
+        <w:t>Manage user access</w:t>
+      </w:r>
+    </w:p>
+    <w:p>
+      <w:r>
+        <w:t xml:space="preserve">All of these sue cases were derived </w:t>
+      </w:r>
+      <w:r>
+        <w:t>form</w:t>
+      </w:r>
+      <w:r>
+        <w:t xml:space="preserve"> </w:t>
+      </w:r>
+      <w:r>
+        <w:t>t</w:t>
+      </w:r>
+      <w:r>
+        <w:t xml:space="preserve">he noun/verb analysis from task 1, and the </w:t>
+      </w:r>
+      <w:r>
+        <w:t>stakeholders’</w:t>
+      </w:r>
+      <w:r>
+        <w:t xml:space="preserve"> interviews from task 2, </w:t>
+      </w:r>
+      <w:proofErr w:type="gramStart"/>
+      <w:r>
+        <w:t>and also</w:t>
+      </w:r>
+      <w:proofErr w:type="gramEnd"/>
+      <w:r>
+        <w:t xml:space="preserve"> be deducing the system </w:t>
+      </w:r>
+      <w:r>
+        <w:t>requirements</w:t>
+      </w:r>
+    </w:p>
+    <w:p/>
+    <w:p/>
+    <w:p/>
+    <w:p/>
+    <w:p>
+      <w:pPr>
+        <w:rPr>
+          <w:b/>
+          <w:bCs/>
+        </w:rPr>
+      </w:pPr>
+    </w:p>
+    <w:p>
+      <w:pPr>
+        <w:rPr>
+          <w:b/>
+          <w:bCs/>
+        </w:rPr>
+      </w:pPr>
+      <w:r>
+        <w:rPr>
+          <w:b/>
+          <w:bCs/>
+        </w:rPr>
+        <w:t xml:space="preserve">3.5 </w:t>
+      </w:r>
+      <w:r>
+        <w:rPr>
+          <w:b/>
+          <w:bCs/>
+        </w:rPr>
+        <w:t>Detailed Use Case Descriptions:</w:t>
+      </w:r>
+    </w:p>
+    <w:p>
+      <w:pPr>
+        <w:rPr>
+          <w:b/>
+          <w:bCs/>
+        </w:rPr>
+      </w:pPr>
+      <w:r>
+        <w:rPr>
+          <w:b/>
+          <w:bCs/>
+        </w:rPr>
+        <w:t>Use Case 1: Track Shipment</w:t>
+      </w:r>
+    </w:p>
+    <w:p>
+      <w:r>
+        <w:t xml:space="preserve">Purpose: The purpose of this </w:t>
+      </w:r>
+      <w:r>
+        <w:t>use case is o track the progress and status of a shipment in real time.</w:t>
+      </w:r>
+    </w:p>
+    <w:p>
+      <w:r>
+        <w:t>Description: This use case allows</w:t>
+      </w:r>
+      <w:r>
+        <w:t xml:space="preserve"> customers or staff to enter a </w:t>
+      </w:r>
+      <w:r>
+        <w:t>shipment</w:t>
+      </w:r>
+      <w:r>
+        <w:t xml:space="preserve"> tracking ID and be able to get up to date shipment information. It improves the </w:t>
+      </w:r>
+      <w:r>
+        <w:t>transparency</w:t>
+      </w:r>
+      <w:r>
+        <w:t xml:space="preserve"> and communication</w:t>
+      </w:r>
+    </w:p>
+    <w:p>
+      <w:r>
+        <w:t xml:space="preserve">Actors: </w:t>
+      </w:r>
+      <w:r>
+        <w:t>Customer</w:t>
+      </w:r>
+      <w:r>
+        <w:t>, Customer Service staff</w:t>
+      </w:r>
+    </w:p>
+    <w:p>
+      <w:r>
+        <w:t>Data Content:</w:t>
+      </w:r>
+    </w:p>
+    <w:p>
+      <w:pPr>
+        <w:pStyle w:val="ListParagraph"/>
+        <w:numPr>
+          <w:ilvl w:val="0"/>
+          <w:numId w:val="1"/>
+        </w:numPr>
+      </w:pPr>
+      <w:r>
+        <w:t>Shipment ID</w:t>
+      </w:r>
+      <w:r>
+        <w:br/>
+        <w:t>Shipment status</w:t>
+      </w:r>
+    </w:p>
+    <w:p>
+      <w:pPr>
+        <w:pStyle w:val="ListParagraph"/>
+        <w:numPr>
+          <w:ilvl w:val="0"/>
+          <w:numId w:val="1"/>
+        </w:numPr>
+      </w:pPr>
+      <w:r>
+        <w:t>Delivery locations</w:t>
+      </w:r>
+    </w:p>
+    <w:p>
+      <w:pPr>
+        <w:pStyle w:val="ListParagraph"/>
+        <w:numPr>
+          <w:ilvl w:val="0"/>
+          <w:numId w:val="1"/>
+        </w:numPr>
+      </w:pPr>
+      <w:r>
+        <w:t>Timestamp updates</w:t>
+      </w:r>
+    </w:p>
+    <w:p>
+      <w:r>
+        <w:t>Preconditions:</w:t>
+      </w:r>
+    </w:p>
+    <w:p>
+      <w:pPr>
+        <w:pStyle w:val="ListParagraph"/>
+        <w:numPr>
+          <w:ilvl w:val="0"/>
+          <w:numId w:val="1"/>
+        </w:numPr>
+      </w:pPr>
+      <w:r>
+        <w:t xml:space="preserve"> </w:t>
+      </w:r>
+      <w:r>
+        <w:t>The user should have valid tracking ID</w:t>
+      </w:r>
+    </w:p>
+    <w:p>
+      <w:pPr>
+        <w:pStyle w:val="ListParagraph"/>
+        <w:numPr>
+          <w:ilvl w:val="0"/>
+          <w:numId w:val="1"/>
+        </w:numPr>
+      </w:pPr>
+      <w:r>
+        <w:lastRenderedPageBreak/>
+        <w:t>Shipment</w:t>
+      </w:r>
+      <w:r>
+        <w:t xml:space="preserve"> should </w:t>
+      </w:r>
+      <w:r>
+        <w:t>exist</w:t>
+      </w:r>
+      <w:r>
+        <w:t xml:space="preserve"> in the system</w:t>
+      </w:r>
+    </w:p>
+    <w:p>
+      <w:r>
+        <w:t>Begins when:</w:t>
+      </w:r>
+    </w:p>
+    <w:p>
+      <w:r>
+        <w:t>The user enters a valid shipment tracking ID</w:t>
+      </w:r>
+    </w:p>
+    <w:p>
+      <w:r>
+        <w:t>Ends When:</w:t>
+      </w:r>
+    </w:p>
+    <w:p>
+      <w:r>
+        <w:t>Shipment information is succe</w:t>
+      </w:r>
+      <w:r>
+        <w:t>ss</w:t>
+      </w:r>
+      <w:r>
+        <w:t>ful</w:t>
+      </w:r>
+      <w:r>
+        <w:t>l</w:t>
+      </w:r>
+      <w:r>
+        <w:t>y displayed to the staff</w:t>
+      </w:r>
+    </w:p>
+    <w:p>
+      <w:r>
+        <w:t>Exceptions:</w:t>
+      </w:r>
+    </w:p>
+    <w:p>
+      <w:pPr>
+        <w:pStyle w:val="ListParagraph"/>
+        <w:numPr>
+          <w:ilvl w:val="0"/>
+          <w:numId w:val="1"/>
+        </w:numPr>
+      </w:pPr>
+      <w:r>
+        <w:t>Invalid tracking ID , the system will display error</w:t>
+      </w:r>
+    </w:p>
+    <w:p>
+      <w:pPr>
+        <w:pStyle w:val="ListParagraph"/>
+        <w:numPr>
+          <w:ilvl w:val="0"/>
+          <w:numId w:val="1"/>
+        </w:numPr>
+      </w:pPr>
+      <w:r>
+        <w:t xml:space="preserve">If shipment not found, system </w:t>
+      </w:r>
+      <w:r>
+        <w:t xml:space="preserve">will </w:t>
+      </w:r>
+      <w:r>
+        <w:t xml:space="preserve">show </w:t>
+      </w:r>
+      <w:r>
+        <w:t>unavailable</w:t>
+      </w:r>
+      <w:r>
+        <w:t xml:space="preserve"> </w:t>
+      </w:r>
+      <w:r>
+        <w:t>message</w:t>
+      </w:r>
+    </w:p>
+    <w:p>
+      <w:r>
+        <w:t>Post Conditions:</w:t>
+      </w:r>
+    </w:p>
+    <w:p>
+      <w:pPr>
+        <w:pStyle w:val="ListParagraph"/>
+        <w:numPr>
+          <w:ilvl w:val="0"/>
+          <w:numId w:val="1"/>
+        </w:numPr>
+      </w:pPr>
+      <w:r>
+        <w:t>The user will receive the current shipment information</w:t>
+      </w:r>
+    </w:p>
+    <w:p>
+      <w:pPr>
+        <w:rPr>
+          <w:b/>
+          <w:bCs/>
+        </w:rPr>
+      </w:pPr>
+      <w:r>
+        <w:rPr>
+          <w:b/>
+          <w:bCs/>
+        </w:rPr>
+        <w:t>Use case 2: View Shipment Information</w:t>
+      </w:r>
+    </w:p>
+    <w:p>
+      <w:r>
+        <w:t>Purpose:</w:t>
+      </w:r>
+      <w:r>
+        <w:t xml:space="preserve"> The purpose </w:t>
+      </w:r>
+      <w:r>
+        <w:t>is to provide the detailed shipment information to users</w:t>
+      </w:r>
+    </w:p>
+    <w:p>
+      <w:r>
+        <w:t>Description:</w:t>
+      </w:r>
+    </w:p>
+    <w:p>
+      <w:r>
+        <w:t xml:space="preserve">This use case allows the users to be able to access the detailed </w:t>
+      </w:r>
+      <w:r>
+        <w:t>information</w:t>
+      </w:r>
+      <w:r>
+        <w:t xml:space="preserve"> of the shipments , this </w:t>
+      </w:r>
+      <w:r>
+        <w:t>information</w:t>
+      </w:r>
+      <w:r>
+        <w:t xml:space="preserve"> includes </w:t>
+      </w:r>
+      <w:r>
+        <w:t>delivery</w:t>
+      </w:r>
+      <w:r>
+        <w:t xml:space="preserve"> details , shipment </w:t>
+      </w:r>
+      <w:r>
+        <w:t>conditions</w:t>
+      </w:r>
+      <w:r>
+        <w:t xml:space="preserve">, and operation updates. It </w:t>
+      </w:r>
+      <w:r>
+        <w:t>supports</w:t>
+      </w:r>
+      <w:r>
+        <w:t xml:space="preserve"> customer service and operational </w:t>
+      </w:r>
+      <w:r>
+        <w:t>decision</w:t>
+      </w:r>
+      <w:r>
+        <w:t xml:space="preserve"> making</w:t>
+      </w:r>
+      <w:r>
+        <w:t>.</w:t>
+      </w:r>
+    </w:p>
+    <w:p>
+      <w:r>
+        <w:t>Actors:</w:t>
+      </w:r>
+      <w:r>
+        <w:t xml:space="preserve"> customer , </w:t>
+      </w:r>
+      <w:r>
+        <w:t>customer</w:t>
+      </w:r>
+      <w:r>
+        <w:t xml:space="preserve"> service staff</w:t>
+      </w:r>
+    </w:p>
+    <w:p>
+      <w:r>
+        <w:t>Data Content:</w:t>
+      </w:r>
+    </w:p>
+    <w:p>
+      <w:pPr>
+        <w:pStyle w:val="ListParagraph"/>
+        <w:numPr>
+          <w:ilvl w:val="0"/>
+          <w:numId w:val="1"/>
+        </w:numPr>
+      </w:pPr>
+      <w:r>
+        <w:t>Shipment details</w:t>
+      </w:r>
+    </w:p>
+    <w:p>
+      <w:pPr>
+        <w:pStyle w:val="ListParagraph"/>
+        <w:numPr>
+          <w:ilvl w:val="0"/>
+          <w:numId w:val="1"/>
+        </w:numPr>
+      </w:pPr>
+      <w:r>
+        <w:t>Customer information</w:t>
+      </w:r>
+    </w:p>
+    <w:p>
+      <w:pPr>
+        <w:pStyle w:val="ListParagraph"/>
+        <w:numPr>
+          <w:ilvl w:val="0"/>
+          <w:numId w:val="1"/>
+        </w:numPr>
+      </w:pPr>
+      <w:r>
+        <w:t>Delivery status</w:t>
+      </w:r>
+    </w:p>
+    <w:p>
+      <w:pPr>
+        <w:pStyle w:val="ListParagraph"/>
+        <w:numPr>
+          <w:ilvl w:val="0"/>
+          <w:numId w:val="1"/>
+        </w:numPr>
+      </w:pPr>
+      <w:r>
+        <w:t>Incident notes</w:t>
+      </w:r>
+    </w:p>
+    <w:p>
+      <w:r>
+        <w:t>Preconditions</w:t>
+      </w:r>
+      <w:r>
+        <w:t>:</w:t>
+      </w:r>
+    </w:p>
+    <w:p>
+      <w:pPr>
+        <w:pStyle w:val="ListParagraph"/>
+        <w:numPr>
+          <w:ilvl w:val="0"/>
+          <w:numId w:val="1"/>
+        </w:numPr>
+      </w:pPr>
+      <w:r>
+        <w:t>The shipment should exist</w:t>
+      </w:r>
+    </w:p>
+    <w:p>
+      <w:pPr>
+        <w:pStyle w:val="ListParagraph"/>
+        <w:numPr>
+          <w:ilvl w:val="0"/>
+          <w:numId w:val="1"/>
+        </w:numPr>
+      </w:pPr>
+      <w:r>
+        <w:t>User should have the access rights</w:t>
+      </w:r>
+    </w:p>
+    <w:p>
+      <w:r>
+        <w:t>Begins When:</w:t>
+      </w:r>
+    </w:p>
+    <w:p>
+      <w:r>
+        <w:t>Begins when the user selects a shipment to view</w:t>
+      </w:r>
+    </w:p>
+    <w:p>
+      <w:r>
+        <w:t>Ends When:</w:t>
+      </w:r>
+    </w:p>
+    <w:p>
+      <w:r>
+        <w:t>It ends when the detailed shipment information is displayed</w:t>
+      </w:r>
+    </w:p>
+    <w:p>
+      <w:r>
+        <w:t>Exceptions:</w:t>
+      </w:r>
+    </w:p>
+    <w:p>
+      <w:pPr>
+        <w:pStyle w:val="ListParagraph"/>
+        <w:numPr>
+          <w:ilvl w:val="0"/>
+          <w:numId w:val="1"/>
+        </w:numPr>
+      </w:pPr>
+      <w:r>
+        <w:lastRenderedPageBreak/>
+        <w:t>If the data is unavailable, then the system shows an error</w:t>
+      </w:r>
+    </w:p>
+    <w:p>
+      <w:r>
+        <w:t>Post conditions:</w:t>
+      </w:r>
+    </w:p>
+    <w:p>
+      <w:pPr>
+        <w:pStyle w:val="ListParagraph"/>
+        <w:numPr>
+          <w:ilvl w:val="0"/>
+          <w:numId w:val="1"/>
+        </w:numPr>
+      </w:pPr>
+      <w:r>
+        <w:t>Shipment details are successfully displayed</w:t>
+      </w:r>
+    </w:p>
+    <w:p/>
+    <w:p>
+      <w:pPr>
+        <w:rPr>
+          <w:b/>
+          <w:bCs/>
+        </w:rPr>
+      </w:pPr>
+      <w:r>
+        <w:rPr>
+          <w:b/>
+          <w:bCs/>
+        </w:rPr>
+        <w:t>Use Case 3: Update Shipment Status</w:t>
+      </w:r>
+    </w:p>
+    <w:p>
+      <w:r>
+        <w:t>Purpose:</w:t>
+      </w:r>
+      <w:r>
+        <w:t xml:space="preserve"> The purpose is </w:t>
+      </w:r>
+      <w:r>
+        <w:t>to</w:t>
+      </w:r>
+      <w:r>
+        <w:t xml:space="preserve"> make sure that the staff </w:t>
+      </w:r>
+      <w:proofErr w:type="gramStart"/>
+      <w:r>
+        <w:t>are able to</w:t>
+      </w:r>
+      <w:proofErr w:type="gramEnd"/>
+      <w:r>
+        <w:t xml:space="preserve"> </w:t>
+      </w:r>
+      <w:r>
+        <w:t>update the shipment progress throughout delivery stages</w:t>
+      </w:r>
+    </w:p>
+    <w:p>
+      <w:r>
+        <w:t>Description:</w:t>
+      </w:r>
+    </w:p>
+    <w:p>
+      <w:r>
+        <w:t xml:space="preserve">This use case </w:t>
+      </w:r>
+      <w:r>
+        <w:t xml:space="preserve">makes sure that the </w:t>
+      </w:r>
+      <w:r>
+        <w:t>transport</w:t>
+      </w:r>
+      <w:r>
+        <w:t xml:space="preserve"> and warehouse staff </w:t>
+      </w:r>
+      <w:proofErr w:type="gramStart"/>
+      <w:r>
+        <w:t>are able to</w:t>
+      </w:r>
+      <w:proofErr w:type="gramEnd"/>
+      <w:r>
+        <w:t xml:space="preserve"> </w:t>
+      </w:r>
+      <w:r>
+        <w:t>update</w:t>
+      </w:r>
+      <w:r>
+        <w:t xml:space="preserve"> the shipment status such as delivered , retuned , or I transit in real time.</w:t>
+      </w:r>
+    </w:p>
+    <w:p>
+      <w:r>
+        <w:t>Actors:</w:t>
+      </w:r>
+    </w:p>
+    <w:p>
+      <w:r>
+        <w:t>Transport staff, warehouse staff</w:t>
+      </w:r>
+    </w:p>
+    <w:p>
+      <w:r>
+        <w:t>Data Content:</w:t>
+      </w:r>
+    </w:p>
+    <w:p>
+      <w:pPr>
+        <w:pStyle w:val="ListParagraph"/>
+        <w:numPr>
+          <w:ilvl w:val="0"/>
+          <w:numId w:val="1"/>
+        </w:numPr>
+      </w:pPr>
+      <w:r>
+        <w:t>Shipment ID</w:t>
+      </w:r>
+    </w:p>
+    <w:p>
+      <w:pPr>
+        <w:pStyle w:val="ListParagraph"/>
+        <w:numPr>
+          <w:ilvl w:val="0"/>
+          <w:numId w:val="1"/>
+        </w:numPr>
+      </w:pPr>
+      <w:r>
+        <w:t>Updated status</w:t>
+      </w:r>
+    </w:p>
+    <w:p>
+      <w:pPr>
+        <w:pStyle w:val="ListParagraph"/>
+        <w:numPr>
+          <w:ilvl w:val="0"/>
+          <w:numId w:val="1"/>
+        </w:numPr>
+      </w:pPr>
+      <w:r>
+        <w:t>Timestamp</w:t>
+      </w:r>
+    </w:p>
+    <w:p>
+      <w:pPr>
+        <w:pStyle w:val="ListParagraph"/>
+        <w:numPr>
+          <w:ilvl w:val="0"/>
+          <w:numId w:val="1"/>
+        </w:numPr>
+      </w:pPr>
+      <w:r>
+        <w:t>Delivery</w:t>
+      </w:r>
+      <w:r>
+        <w:t xml:space="preserve"> notes</w:t>
+      </w:r>
+    </w:p>
+    <w:p>
+      <w:r>
+        <w:t>Preconditions</w:t>
+      </w:r>
+      <w:r>
+        <w:t>:</w:t>
+      </w:r>
+    </w:p>
+    <w:p>
+      <w:pPr>
+        <w:pStyle w:val="ListParagraph"/>
+        <w:numPr>
+          <w:ilvl w:val="0"/>
+          <w:numId w:val="1"/>
+        </w:numPr>
+      </w:pPr>
+      <w:r>
+        <w:t>For the use case to be carried out the staff must be aut</w:t>
+      </w:r>
+      <w:r>
+        <w:t>horised</w:t>
+      </w:r>
+    </w:p>
+    <w:p>
+      <w:pPr>
+        <w:pStyle w:val="ListParagraph"/>
+        <w:numPr>
+          <w:ilvl w:val="0"/>
+          <w:numId w:val="1"/>
+        </w:numPr>
+      </w:pPr>
+      <w:r>
+        <w:t>The shipment must exist</w:t>
+      </w:r>
+    </w:p>
+    <w:p>
+      <w:r>
+        <w:t>Begins When:</w:t>
+      </w:r>
+    </w:p>
+    <w:p>
+      <w:pPr>
+        <w:pStyle w:val="ListParagraph"/>
+        <w:numPr>
+          <w:ilvl w:val="0"/>
+          <w:numId w:val="1"/>
+        </w:numPr>
+      </w:pPr>
+      <w:r>
+        <w:t>Staff selects a shipment to update</w:t>
+      </w:r>
+    </w:p>
+    <w:p>
+      <w:r>
+        <w:t>Ends When:</w:t>
+      </w:r>
+    </w:p>
+    <w:p>
+      <w:pPr>
+        <w:pStyle w:val="ListParagraph"/>
+        <w:numPr>
+          <w:ilvl w:val="0"/>
+          <w:numId w:val="1"/>
+        </w:numPr>
+      </w:pPr>
+      <w:r>
+        <w:t>The shipment is updated in the system</w:t>
+      </w:r>
+    </w:p>
+    <w:p>
+      <w:r>
+        <w:t>Exceptions:</w:t>
+      </w:r>
+    </w:p>
+    <w:p>
+      <w:pPr>
+        <w:pStyle w:val="ListParagraph"/>
+        <w:numPr>
+          <w:ilvl w:val="0"/>
+          <w:numId w:val="1"/>
+        </w:numPr>
+      </w:pPr>
+      <w:r>
+        <w:t xml:space="preserve">If the </w:t>
+      </w:r>
+      <w:r>
+        <w:t>update</w:t>
+      </w:r>
+      <w:r>
+        <w:t xml:space="preserve"> is </w:t>
+      </w:r>
+      <w:r>
+        <w:t>invalid,</w:t>
+      </w:r>
+      <w:r>
+        <w:t xml:space="preserve"> then the system rejects the change of </w:t>
+      </w:r>
+      <w:r>
+        <w:t>update status</w:t>
+      </w:r>
+    </w:p>
+    <w:p>
+      <w:pPr>
+        <w:pStyle w:val="ListParagraph"/>
+        <w:numPr>
+          <w:ilvl w:val="0"/>
+          <w:numId w:val="1"/>
+        </w:numPr>
+      </w:pPr>
+      <w:r>
+        <w:t>If the system throws an error the update will also not take place</w:t>
+      </w:r>
+    </w:p>
+    <w:p>
+      <w:r>
+        <w:t>Post conditions:</w:t>
+      </w:r>
+    </w:p>
+    <w:p>
+      <w:pPr>
+        <w:pStyle w:val="ListParagraph"/>
+        <w:numPr>
+          <w:ilvl w:val="0"/>
+          <w:numId w:val="1"/>
+        </w:numPr>
+      </w:pPr>
+      <w:r>
+        <w:t xml:space="preserve">If the update is </w:t>
+      </w:r>
+      <w:r>
+        <w:t>successful,</w:t>
+      </w:r>
+      <w:r>
+        <w:t xml:space="preserve"> the status is updated and </w:t>
+      </w:r>
+      <w:r>
+        <w:t>visible</w:t>
+      </w:r>
+      <w:r>
+        <w:t xml:space="preserve"> to all the departments</w:t>
+      </w:r>
+    </w:p>
+    <w:p>
+      <w:pPr>
+        <w:rPr>
+          <w:b/>
+          <w:bCs/>
+        </w:rPr>
+      </w:pPr>
+      <w:r>
+        <w:rPr>
+          <w:b/>
+          <w:bCs/>
+        </w:rPr>
+        <w:lastRenderedPageBreak/>
+        <w:t>Use Case 4: Manage Inventory</w:t>
+      </w:r>
+    </w:p>
+    <w:p>
+      <w:r>
+        <w:t>Purpose:</w:t>
+      </w:r>
+      <w:r>
+        <w:t xml:space="preserve"> To manage the warehouse inventory and its </w:t>
+      </w:r>
+      <w:r>
+        <w:t>s</w:t>
+      </w:r>
+      <w:r>
+        <w:t>tor</w:t>
+      </w:r>
+      <w:r>
+        <w:t>ed</w:t>
+      </w:r>
+      <w:r>
+        <w:t xml:space="preserve"> goods</w:t>
+      </w:r>
+      <w:r>
+        <w:t xml:space="preserve"> across the log</w:t>
+      </w:r>
+      <w:r>
+        <w:t>is</w:t>
+      </w:r>
+      <w:r>
+        <w:t>tics system</w:t>
+      </w:r>
+    </w:p>
+    <w:p>
+      <w:r>
+        <w:t>Description:</w:t>
+      </w:r>
+    </w:p>
+    <w:p>
+      <w:r>
+        <w:t>This use case ensures that the warehouse staff can ma</w:t>
+      </w:r>
+      <w:r>
+        <w:t>n</w:t>
+      </w:r>
+      <w:r>
+        <w:t>a</w:t>
+      </w:r>
+      <w:r>
+        <w:t>g</w:t>
+      </w:r>
+      <w:r>
+        <w:t xml:space="preserve">e the </w:t>
+      </w:r>
+      <w:r>
+        <w:t>inventory</w:t>
+      </w:r>
+      <w:r>
+        <w:t xml:space="preserve"> records, track the stored good, and be able to update stock information</w:t>
+      </w:r>
+      <w:r>
+        <w:t xml:space="preserve"> while also allowing the transport staff to view the relevant </w:t>
+      </w:r>
+      <w:r>
+        <w:t>inventory</w:t>
+      </w:r>
+      <w:r>
+        <w:t xml:space="preserve"> data for shipment </w:t>
+      </w:r>
+      <w:r>
+        <w:t>coordination</w:t>
+      </w:r>
+      <w:r>
+        <w:t>.</w:t>
+      </w:r>
+      <w:r>
+        <w:t xml:space="preserve"> It makes sure that the </w:t>
+      </w:r>
+      <w:r>
+        <w:t>inventory</w:t>
+      </w:r>
+      <w:r>
+        <w:t xml:space="preserve"> </w:t>
+      </w:r>
+      <w:r>
+        <w:t>management</w:t>
+      </w:r>
+      <w:r>
+        <w:t xml:space="preserve"> is </w:t>
+      </w:r>
+      <w:r>
+        <w:t>supported efficiently.</w:t>
+      </w:r>
+    </w:p>
+    <w:p>
+      <w:r>
+        <w:t>Actors:</w:t>
+      </w:r>
+      <w:r>
+        <w:t xml:space="preserve"> </w:t>
+      </w:r>
+    </w:p>
+    <w:p>
+      <w:r>
+        <w:t>warehouse staff</w:t>
+      </w:r>
+    </w:p>
+    <w:p>
+      <w:r>
+        <w:t xml:space="preserve">transport staff, secondary have limited view </w:t>
+      </w:r>
+      <w:r>
+        <w:t>access</w:t>
+      </w:r>
+    </w:p>
+    <w:p>
+      <w:r>
+        <w:t>Data Content:</w:t>
+      </w:r>
+    </w:p>
+    <w:p>
+      <w:pPr>
+        <w:pStyle w:val="ListParagraph"/>
+        <w:numPr>
+          <w:ilvl w:val="0"/>
+          <w:numId w:val="1"/>
+        </w:numPr>
+      </w:pPr>
+      <w:r>
+        <w:t>Inventory records</w:t>
+      </w:r>
+    </w:p>
+    <w:p>
+      <w:pPr>
+        <w:pStyle w:val="ListParagraph"/>
+        <w:numPr>
+          <w:ilvl w:val="0"/>
+          <w:numId w:val="1"/>
+        </w:numPr>
+      </w:pPr>
+      <w:r>
+        <w:t>Product details</w:t>
+      </w:r>
+    </w:p>
+    <w:p>
+      <w:pPr>
+        <w:pStyle w:val="ListParagraph"/>
+        <w:numPr>
+          <w:ilvl w:val="0"/>
+          <w:numId w:val="1"/>
+        </w:numPr>
+      </w:pPr>
+      <w:r>
+        <w:t>Storage con</w:t>
+      </w:r>
+      <w:r>
+        <w:t>di</w:t>
+      </w:r>
+      <w:r>
+        <w:t>tions</w:t>
+      </w:r>
+    </w:p>
+    <w:p>
+      <w:pPr>
+        <w:pStyle w:val="ListParagraph"/>
+        <w:numPr>
+          <w:ilvl w:val="0"/>
+          <w:numId w:val="1"/>
+        </w:numPr>
+      </w:pPr>
+      <w:r>
+        <w:t>Quality</w:t>
+      </w:r>
+    </w:p>
+    <w:p>
+      <w:pPr>
+        <w:pStyle w:val="ListParagraph"/>
+      </w:pPr>
+    </w:p>
+    <w:p>
+      <w:r>
+        <w:t>Preconditions</w:t>
+      </w:r>
+      <w:r>
+        <w:t>:</w:t>
+      </w:r>
+    </w:p>
+    <w:p>
+      <w:pPr>
+        <w:pStyle w:val="ListParagraph"/>
+        <w:numPr>
+          <w:ilvl w:val="0"/>
+          <w:numId w:val="1"/>
+        </w:numPr>
+      </w:pPr>
+      <w:r>
+        <w:t>To</w:t>
+      </w:r>
+      <w:r>
+        <w:t xml:space="preserve"> be able to manage the staff must be authenticated</w:t>
+      </w:r>
+    </w:p>
+    <w:p>
+      <w:pPr>
+        <w:pStyle w:val="ListParagraph"/>
+        <w:numPr>
+          <w:ilvl w:val="0"/>
+          <w:numId w:val="1"/>
+        </w:numPr>
+      </w:pPr>
+      <w:r>
+        <w:t>The inventory data must exist</w:t>
+      </w:r>
+    </w:p>
+    <w:p>
+      <w:r>
+        <w:t>Begins When:</w:t>
+      </w:r>
+    </w:p>
+    <w:p>
+      <w:pPr>
+        <w:pStyle w:val="ListParagraph"/>
+        <w:numPr>
+          <w:ilvl w:val="0"/>
+          <w:numId w:val="1"/>
+        </w:numPr>
+      </w:pPr>
+      <w:r>
+        <w:t>The staff access the inventory system</w:t>
+      </w:r>
+    </w:p>
+    <w:p>
+      <w:r>
+        <w:t>Ends When:</w:t>
+      </w:r>
+    </w:p>
+    <w:p>
+      <w:pPr>
+        <w:pStyle w:val="ListParagraph"/>
+        <w:numPr>
+          <w:ilvl w:val="0"/>
+          <w:numId w:val="1"/>
+        </w:numPr>
+      </w:pPr>
+      <w:r>
+        <w:t xml:space="preserve">It ends when the inventory </w:t>
+      </w:r>
+      <w:r>
+        <w:t>records are updated</w:t>
+      </w:r>
+    </w:p>
+    <w:p>
+      <w:r>
+        <w:t>Exceptions:</w:t>
+      </w:r>
+    </w:p>
+    <w:p>
+      <w:pPr>
+        <w:pStyle w:val="ListParagraph"/>
+        <w:numPr>
+          <w:ilvl w:val="0"/>
+          <w:numId w:val="1"/>
+        </w:numPr>
+      </w:pPr>
+      <w:r>
+        <w:t xml:space="preserve">If the </w:t>
+      </w:r>
+      <w:r>
+        <w:t>input</w:t>
+      </w:r>
+      <w:r>
+        <w:t xml:space="preserve"> is not accepted and </w:t>
+      </w:r>
+      <w:r>
+        <w:t>the system displays an error</w:t>
+      </w:r>
+    </w:p>
+    <w:p>
+      <w:r>
+        <w:t>Post conditions:</w:t>
+      </w:r>
+    </w:p>
+    <w:p>
+      <w:pPr>
+        <w:pStyle w:val="ListParagraph"/>
+        <w:numPr>
+          <w:ilvl w:val="0"/>
+          <w:numId w:val="1"/>
+        </w:numPr>
+      </w:pPr>
+      <w:r>
+        <w:t xml:space="preserve">The </w:t>
+      </w:r>
+      <w:r>
+        <w:t>inventory</w:t>
+      </w:r>
+      <w:r>
+        <w:t xml:space="preserve"> will then be </w:t>
+      </w:r>
+      <w:r>
+        <w:t>successfully</w:t>
+      </w:r>
+      <w:r>
+        <w:t xml:space="preserve"> updated and stored</w:t>
+      </w:r>
+    </w:p>
+    <w:p>
+      <w:pPr>
+        <w:rPr>
+          <w:b/>
+          <w:bCs/>
+        </w:rPr>
+      </w:pPr>
+      <w:r>
+        <w:rPr>
+          <w:b/>
+          <w:bCs/>
+        </w:rPr>
+        <w:t>Use case 5: Manage User Access</w:t>
+      </w:r>
+    </w:p>
+    <w:p>
+      <w:r>
+        <w:t>Purpose:</w:t>
+      </w:r>
+      <w:r>
+        <w:t xml:space="preserve"> This</w:t>
+      </w:r>
+      <w:r>
+        <w:t xml:space="preserve"> is</w:t>
+      </w:r>
+      <w:r>
+        <w:t xml:space="preserve"> to </w:t>
+      </w:r>
+      <w:r>
+        <w:t>ensure</w:t>
+      </w:r>
+      <w:r>
+        <w:t xml:space="preserve"> that the correct users </w:t>
+      </w:r>
+      <w:proofErr w:type="gramStart"/>
+      <w:r>
+        <w:t xml:space="preserve">are </w:t>
+      </w:r>
+      <w:r>
+        <w:t>able</w:t>
+      </w:r>
+      <w:r>
+        <w:t xml:space="preserve"> to</w:t>
+      </w:r>
+      <w:proofErr w:type="gramEnd"/>
+      <w:r>
+        <w:t xml:space="preserve"> access the needed </w:t>
+      </w:r>
+      <w:r>
+        <w:t>accepts</w:t>
+      </w:r>
+      <w:r>
+        <w:t xml:space="preserve"> of the system in a safe an</w:t>
+      </w:r>
+      <w:r>
+        <w:t>d</w:t>
+      </w:r>
+      <w:r>
+        <w:t xml:space="preserve"> secure way.</w:t>
+      </w:r>
+    </w:p>
+    <w:p>
+      <w:r>
+        <w:lastRenderedPageBreak/>
+        <w:t>Description:</w:t>
+      </w:r>
+    </w:p>
+    <w:p>
+      <w:r>
+        <w:t xml:space="preserve">This use case makes sure that the administrators </w:t>
+      </w:r>
+      <w:r>
+        <w:t>can mange the user accounts , assign roles, and control the access permission to make sure that the system is safe and secure</w:t>
+      </w:r>
+    </w:p>
+    <w:p>
+      <w:r>
+        <w:t>Actors:</w:t>
+      </w:r>
+    </w:p>
+    <w:p>
+      <w:r>
+        <w:t>Admin</w:t>
+      </w:r>
+    </w:p>
+    <w:p>
+      <w:r>
+        <w:t>Data Content:</w:t>
+      </w:r>
+    </w:p>
+    <w:p>
+      <w:pPr>
+        <w:pStyle w:val="ListParagraph"/>
+        <w:numPr>
+          <w:ilvl w:val="0"/>
+          <w:numId w:val="1"/>
+        </w:numPr>
+      </w:pPr>
+      <w:r>
+        <w:t>User details</w:t>
+      </w:r>
+    </w:p>
+    <w:p>
+      <w:pPr>
+        <w:pStyle w:val="ListParagraph"/>
+        <w:numPr>
+          <w:ilvl w:val="0"/>
+          <w:numId w:val="1"/>
+        </w:numPr>
+      </w:pPr>
+      <w:r>
+        <w:t>Roles</w:t>
+      </w:r>
+    </w:p>
+    <w:p>
+      <w:pPr>
+        <w:pStyle w:val="ListParagraph"/>
+        <w:numPr>
+          <w:ilvl w:val="0"/>
+          <w:numId w:val="1"/>
+        </w:numPr>
+      </w:pPr>
+      <w:r>
+        <w:t>P</w:t>
+      </w:r>
+      <w:r>
+        <w:t>ermis</w:t>
+      </w:r>
+      <w:r>
+        <w:t>sions</w:t>
+      </w:r>
+    </w:p>
+    <w:p>
+      <w:pPr>
+        <w:pStyle w:val="ListParagraph"/>
+      </w:pPr>
+    </w:p>
+    <w:p>
+      <w:r>
+        <w:t>Preconditions</w:t>
+      </w:r>
+      <w:r>
+        <w:t>:</w:t>
+      </w:r>
+    </w:p>
+    <w:p>
+      <w:pPr>
+        <w:pStyle w:val="ListParagraph"/>
+        <w:numPr>
+          <w:ilvl w:val="0"/>
+          <w:numId w:val="1"/>
+        </w:numPr>
+      </w:pPr>
+      <w:r>
+        <w:t xml:space="preserve">The admin needs to be authenticated to </w:t>
+      </w:r>
+      <w:r>
+        <w:t>implement the</w:t>
+      </w:r>
+      <w:r>
+        <w:t xml:space="preserve"> use case</w:t>
+      </w:r>
+    </w:p>
+    <w:p>
+      <w:r>
+        <w:t>Begins When:</w:t>
+      </w:r>
+    </w:p>
+    <w:p>
+      <w:pPr>
+        <w:pStyle w:val="ListParagraph"/>
+        <w:numPr>
+          <w:ilvl w:val="0"/>
+          <w:numId w:val="1"/>
+        </w:numPr>
+      </w:pPr>
+      <w:r>
+        <w:t xml:space="preserve">It </w:t>
+      </w:r>
+      <w:r>
+        <w:t>starts</w:t>
+      </w:r>
+      <w:r>
+        <w:t xml:space="preserve"> when the admins access the user management system</w:t>
+      </w:r>
+    </w:p>
+    <w:p>
+      <w:r>
+        <w:t>Ends When:</w:t>
+      </w:r>
+    </w:p>
+    <w:p>
+      <w:pPr>
+        <w:pStyle w:val="ListParagraph"/>
+        <w:numPr>
+          <w:ilvl w:val="0"/>
+          <w:numId w:val="1"/>
+        </w:numPr>
+      </w:pPr>
+      <w:r>
+        <w:t>When the user roles and permission are updated the use case ends</w:t>
+      </w:r>
+    </w:p>
+    <w:p>
+      <w:r>
+        <w:t>Exceptions:</w:t>
+      </w:r>
+    </w:p>
+    <w:p>
+      <w:pPr>
+        <w:pStyle w:val="ListParagraph"/>
+        <w:numPr>
+          <w:ilvl w:val="0"/>
+          <w:numId w:val="1"/>
+        </w:numPr>
+      </w:pPr>
+      <w:r>
+        <w:t xml:space="preserve">If the role </w:t>
+      </w:r>
+      <w:r>
+        <w:t>updating</w:t>
+      </w:r>
+      <w:r>
+        <w:t xml:space="preserve"> is </w:t>
+      </w:r>
+      <w:r>
+        <w:t>invalid,</w:t>
+      </w:r>
+      <w:r>
+        <w:t xml:space="preserve"> then a system error will show</w:t>
+      </w:r>
+    </w:p>
+    <w:p>
+      <w:r>
+        <w:t>Post conditions:</w:t>
+      </w:r>
+    </w:p>
+    <w:p>
+      <w:pPr>
+        <w:pStyle w:val="ListParagraph"/>
+        <w:numPr>
+          <w:ilvl w:val="0"/>
+          <w:numId w:val="1"/>
+        </w:numPr>
+      </w:pPr>
+      <w:r>
+        <w:t xml:space="preserve">The user access and role </w:t>
+      </w:r>
+      <w:r>
+        <w:t>updating</w:t>
+      </w:r>
+      <w:r>
+        <w:t xml:space="preserve"> will be successful</w:t>
+      </w:r>
+    </w:p>
+    <w:p/>
+    <w:p>
+      <w:pPr>
+        <w:rPr>
+          <w:b/>
+          <w:bCs/>
+        </w:rPr>
+      </w:pPr>
+      <w:r>
+        <w:rPr>
+          <w:b/>
+          <w:bCs/>
+        </w:rPr>
+        <w:t xml:space="preserve">3.6 </w:t>
+      </w:r>
+      <w:r>
+        <w:rPr>
+          <w:b/>
+          <w:bCs/>
+        </w:rPr>
+        <w:t xml:space="preserve">The </w:t>
+      </w:r>
+      <w:r>
+        <w:rPr>
+          <w:b/>
+          <w:bCs/>
+        </w:rPr>
+        <w:t>relationships</w:t>
+      </w:r>
+      <w:r>
+        <w:rPr>
+          <w:b/>
+          <w:bCs/>
+        </w:rPr>
+        <w:t xml:space="preserve"> explained:</w:t>
+      </w:r>
+    </w:p>
+    <w:p>
+      <w:r>
+        <w:t xml:space="preserve">This use case diagram includes </w:t>
+      </w:r>
+      <w:r>
+        <w:rPr>
+          <w:b/>
+          <w:bCs/>
+        </w:rPr>
+        <w:t>&lt;&lt;include&gt;&gt;,</w:t>
+      </w:r>
+      <w:r>
+        <w:t xml:space="preserve"> </w:t>
+      </w:r>
+      <w:r>
+        <w:rPr>
+          <w:b/>
+          <w:bCs/>
+        </w:rPr>
+        <w:t>&lt;&lt;extend&gt;&gt;,</w:t>
+      </w:r>
+      <w:r>
+        <w:t xml:space="preserve"> and the </w:t>
+      </w:r>
+      <w:r>
+        <w:t>generalization</w:t>
+      </w:r>
+      <w:r>
+        <w:t xml:space="preserve"> relationship to make sure that the system </w:t>
+      </w:r>
+      <w:r>
+        <w:t xml:space="preserve">functionality is </w:t>
+      </w:r>
+      <w:r>
+        <w:t>structure</w:t>
+      </w:r>
+      <w:r>
+        <w:t xml:space="preserve"> </w:t>
+      </w:r>
+      <w:r>
+        <w:t>efficiently</w:t>
+      </w:r>
+      <w:r>
+        <w:t>.</w:t>
+      </w:r>
+    </w:p>
+    <w:p>
+      <w:r>
+        <w:t>I</w:t>
+      </w:r>
+      <w:r>
+        <w:t>n</w:t>
+      </w:r>
+      <w:r>
+        <w:t xml:space="preserve"> the diagram above , the </w:t>
+      </w:r>
+      <w:r>
+        <w:rPr>
+          <w:b/>
+          <w:bCs/>
+        </w:rPr>
+        <w:t>&lt;&lt;include&gt;&gt;</w:t>
+      </w:r>
+      <w:r>
+        <w:t xml:space="preserve"> relationship is applied to the </w:t>
+      </w:r>
+      <w:r>
+        <w:rPr>
+          <w:b/>
+          <w:bCs/>
+          <w:i/>
+          <w:iCs/>
+        </w:rPr>
+        <w:t xml:space="preserve">Mange </w:t>
+      </w:r>
+      <w:r>
+        <w:rPr>
+          <w:b/>
+          <w:bCs/>
+          <w:i/>
+          <w:iCs/>
+        </w:rPr>
+        <w:t>Inventory</w:t>
+      </w:r>
+      <w:r>
+        <w:t xml:space="preserve"> and </w:t>
+      </w:r>
+      <w:r>
+        <w:rPr>
+          <w:b/>
+          <w:bCs/>
+          <w:i/>
+          <w:iCs/>
+        </w:rPr>
+        <w:t>Process Returned Goods</w:t>
+      </w:r>
+      <w:r>
+        <w:t xml:space="preserve"> use cases. This is done to show that processing a returned good is a required part of managing the </w:t>
+      </w:r>
+      <w:r>
+        <w:t>inventory</w:t>
+      </w:r>
+      <w:r>
+        <w:t xml:space="preserve">. </w:t>
+      </w:r>
+      <w:r>
+        <w:t>Whenever</w:t>
+      </w:r>
+      <w:r>
         <w:t xml:space="preserve"> the </w:t>
       </w:r>
       <w:r>
-        <w:t>shipments</w:t>
-      </w:r>
-      <w:r>
-        <w:t xml:space="preserve"> and operational information.</w:t>
-      </w:r>
-    </w:p>
-    <w:p/>
-    <w:p>
-      <w:r>
-        <w:t>IT Administrators</w:t>
-      </w:r>
-    </w:p>
-    <w:p>
-      <w:pPr>
-        <w:pStyle w:val="ListParagraph"/>
-        <w:numPr>
-          <w:ilvl w:val="0"/>
-          <w:numId w:val="1"/>
-        </w:numPr>
-      </w:pPr>
-      <w:r>
-        <w:t xml:space="preserve">IT </w:t>
-      </w:r>
-      <w:r>
-        <w:t>administrators</w:t>
-      </w:r>
-      <w:r>
-        <w:t xml:space="preserve"> require the system to manage user access and maintain system performance</w:t>
+        <w:t>inventory</w:t>
+      </w:r>
+      <w:r>
+        <w:t xml:space="preserve"> is manged, the </w:t>
+      </w:r>
+      <w:r>
+        <w:t>returned</w:t>
+      </w:r>
+      <w:r>
+        <w:t xml:space="preserve"> goods also need to be handled as part of the process. </w:t>
+      </w:r>
+    </w:p>
+    <w:p>
+      <w:r>
+        <w:t xml:space="preserve">The second </w:t>
+      </w:r>
+      <w:r>
+        <w:rPr>
+          <w:b/>
+          <w:bCs/>
+        </w:rPr>
+        <w:t>&lt;&lt;include&gt;&gt;</w:t>
+      </w:r>
+      <w:r>
+        <w:t xml:space="preserve"> relationship that is s</w:t>
+      </w:r>
+      <w:r>
+        <w:t>ho</w:t>
+      </w:r>
+      <w:r>
+        <w:t xml:space="preserve">wn in the diagram is the one between the Track shipment and View shipment Information. </w:t>
+      </w:r>
+      <w:r>
+        <w:t xml:space="preserve">This is done because when a user </w:t>
+      </w:r>
+      <w:r>
+        <w:lastRenderedPageBreak/>
+        <w:t xml:space="preserve">tracks a particular shipment, the system needs to </w:t>
+      </w:r>
+      <w:r>
+        <w:t>retrieve</w:t>
+      </w:r>
+      <w:r>
+        <w:t xml:space="preserve"> and</w:t>
+      </w:r>
+      <w:r>
+        <w:t xml:space="preserve"> update</w:t>
+      </w:r>
+      <w:r>
+        <w:t xml:space="preserve"> the shipment details as part of the process. </w:t>
+      </w:r>
+      <w:r>
+        <w:t>Without</w:t>
+      </w:r>
+      <w:r>
+        <w:t xml:space="preserve"> this information the tracking cannot </w:t>
+      </w:r>
+      <w:r>
+        <w:t>occur,</w:t>
+      </w:r>
+      <w:r>
+        <w:t xml:space="preserve"> so this </w:t>
+      </w:r>
+      <w:r>
+        <w:t>behaviour</w:t>
+      </w:r>
+      <w:r>
+        <w:t xml:space="preserve"> is deemed as a necessary step.</w:t>
+      </w:r>
+    </w:p>
+    <w:p>
+      <w:r>
+        <w:t xml:space="preserve">There is only one </w:t>
+      </w:r>
+      <w:r>
+        <w:rPr>
+          <w:b/>
+          <w:bCs/>
+        </w:rPr>
+        <w:t>&lt;&lt;extend&gt;&gt;</w:t>
+      </w:r>
+      <w:r>
+        <w:t xml:space="preserve"> relationship that is show in the </w:t>
+      </w:r>
+      <w:r>
+        <w:t>diagram</w:t>
+      </w:r>
+      <w:r>
+        <w:t xml:space="preserve">. This </w:t>
+      </w:r>
+      <w:r>
+        <w:t>is</w:t>
+      </w:r>
+      <w:r>
+        <w:t xml:space="preserve"> between the </w:t>
+      </w:r>
+      <w:r>
+        <w:rPr>
+          <w:b/>
+          <w:bCs/>
+          <w:i/>
+          <w:iCs/>
+        </w:rPr>
+        <w:t>Handle customer Enquiry</w:t>
+      </w:r>
+      <w:r>
+        <w:t xml:space="preserve"> and </w:t>
+      </w:r>
+      <w:r>
+        <w:rPr>
+          <w:b/>
+          <w:bCs/>
+          <w:i/>
+          <w:iCs/>
+        </w:rPr>
+        <w:t>Track Shipment</w:t>
+      </w:r>
+      <w:r>
+        <w:t xml:space="preserve">. </w:t>
+      </w:r>
+      <w:r>
+        <w:t xml:space="preserve">This is because of the </w:t>
+      </w:r>
+      <w:r>
+        <w:t>conditional</w:t>
+      </w:r>
+      <w:r>
+        <w:t xml:space="preserve"> behaviour between both the use cases. When a </w:t>
+      </w:r>
+      <w:r>
+        <w:t xml:space="preserve">customer enquiry is </w:t>
+      </w:r>
+      <w:r>
+        <w:t>being</w:t>
+      </w:r>
+      <w:r>
+        <w:t xml:space="preserve"> handled there are times that the tracking information f the shipment needs to be </w:t>
+      </w:r>
+      <w:r>
+        <w:t>accessed</w:t>
+      </w:r>
+      <w:r>
+        <w:t xml:space="preserve"> . The status needs to be accessed by the customer served staff as needed</w:t>
+      </w:r>
+      <w:r>
+        <w:t xml:space="preserve">. </w:t>
+      </w:r>
+      <w:r>
+        <w:t>Otherwise,</w:t>
+      </w:r>
+      <w:r>
+        <w:t xml:space="preserve"> the customer service staff</w:t>
+      </w:r>
+      <w:r>
+        <w:t xml:space="preserve"> will need to contact the </w:t>
+      </w:r>
+      <w:r>
+        <w:t>transport</w:t>
+      </w:r>
+      <w:r>
+        <w:t xml:space="preserve"> team and request </w:t>
+      </w:r>
+      <w:r>
+        <w:t>the</w:t>
+      </w:r>
+      <w:r>
+        <w:t xml:space="preserve"> information , then be able to give the information to the customer. Which hinders the </w:t>
+      </w:r>
+      <w:r>
+        <w:t>efficiency</w:t>
+      </w:r>
+      <w:r>
+        <w:t xml:space="preserve"> of </w:t>
+      </w:r>
+      <w:r>
+        <w:t>everyone’s</w:t>
+      </w:r>
+      <w:r>
+        <w:t xml:space="preserve"> job </w:t>
+      </w:r>
+      <w:proofErr w:type="gramStart"/>
+      <w:r>
+        <w:t>and also</w:t>
+      </w:r>
+      <w:proofErr w:type="gramEnd"/>
+      <w:r>
+        <w:t xml:space="preserve"> </w:t>
+      </w:r>
+      <w:r>
+        <w:t>invoices</w:t>
+      </w:r>
+      <w:r>
+        <w:t xml:space="preserve"> the customer.</w:t>
+      </w:r>
+      <w:r>
+        <w:t xml:space="preserve"> </w:t>
+      </w:r>
+      <w:r>
+        <w:t>So,</w:t>
+      </w:r>
+      <w:r>
+        <w:t xml:space="preserve"> this relationship allows for the system to support the additional functionality while also reserving the </w:t>
+      </w:r>
+      <w:r>
+        <w:t>induvial</w:t>
+      </w:r>
+      <w:r>
+        <w:t xml:space="preserve"> process of each department.</w:t>
+      </w:r>
+    </w:p>
+    <w:p>
+      <w:r>
+        <w:t xml:space="preserve">The </w:t>
+      </w:r>
+      <w:r>
+        <w:t>generalisation</w:t>
+      </w:r>
+      <w:r>
+        <w:t xml:space="preserve"> done in the use case diagram is the </w:t>
+      </w:r>
+      <w:r>
+        <w:t>generalisation</w:t>
+      </w:r>
+      <w:r>
+        <w:t xml:space="preserve"> between the actors. </w:t>
+      </w:r>
+      <w:r>
+        <w:t xml:space="preserve">The </w:t>
+      </w:r>
+      <w:r>
+        <w:t>generalisation</w:t>
+      </w:r>
+      <w:r>
+        <w:t xml:space="preserve"> represents </w:t>
+      </w:r>
+      <w:r>
+        <w:t xml:space="preserve">the relationship between the staff and the </w:t>
+      </w:r>
+      <w:r>
+        <w:t xml:space="preserve"> specialised</w:t>
+      </w:r>
+      <w:r>
+        <w:t xml:space="preserve"> actors , transport staff</w:t>
+      </w:r>
+      <w:r>
+        <w:t>,</w:t>
+      </w:r>
+      <w:r>
+        <w:t xml:space="preserve"> warehouse staff</w:t>
+      </w:r>
+      <w:r>
+        <w:t>, and customer service staff</w:t>
+      </w:r>
+      <w:r>
+        <w:t xml:space="preserve">. This indicated that the actors involved share common interactions </w:t>
+      </w:r>
+      <w:r>
+        <w:t>within</w:t>
+      </w:r>
+      <w:r>
+        <w:t xml:space="preserve"> the </w:t>
+      </w:r>
+      <w:r>
+        <w:t>system</w:t>
+      </w:r>
+      <w:r>
+        <w:t xml:space="preserve">. Some of these interactions include accessing shipment information, participating in operation </w:t>
+      </w:r>
+      <w:r>
+        <w:t>workflows</w:t>
+      </w:r>
+      <w:r>
+        <w:t xml:space="preserve">, while also have </w:t>
+      </w:r>
+      <w:r>
+        <w:t>roles</w:t>
+      </w:r>
+      <w:r>
+        <w:t xml:space="preserve"> </w:t>
+      </w:r>
+      <w:r>
+        <w:t>specific</w:t>
+      </w:r>
+      <w:r>
+        <w:t xml:space="preserve">  </w:t>
+      </w:r>
+      <w:r>
+        <w:t>responsibilities</w:t>
+      </w:r>
+      <w:r>
+        <w:t xml:space="preserve"> as opposed to </w:t>
+      </w:r>
+      <w:r>
+        <w:t>the</w:t>
+      </w:r>
+      <w:r>
+        <w:rPr>
+          <w:b/>
+          <w:bCs/>
+        </w:rPr>
+        <w:t xml:space="preserve"> </w:t>
+      </w:r>
+      <w:r>
+        <w:rPr>
+          <w:b/>
+          <w:bCs/>
+          <w:i/>
+          <w:iCs/>
+        </w:rPr>
+        <w:t>customer</w:t>
+      </w:r>
+      <w:r>
+        <w:rPr>
+          <w:i/>
+          <w:iCs/>
+        </w:rPr>
+        <w:t xml:space="preserve"> </w:t>
+      </w:r>
+      <w:r>
+        <w:t>who</w:t>
+      </w:r>
+      <w:r>
+        <w:t xml:space="preserve"> </w:t>
+      </w:r>
+      <w:r>
+        <w:t>is an</w:t>
+      </w:r>
+      <w:r>
+        <w:t xml:space="preserve"> external </w:t>
+      </w:r>
+      <w:r>
+        <w:t>stakeholder</w:t>
       </w:r>
       <w:r>
         <w:t>.</w:t>
       </w:r>
     </w:p>
-    <w:p>
-      <w:pPr>
-        <w:pStyle w:val="ListParagraph"/>
-        <w:numPr>
-          <w:ilvl w:val="0"/>
-          <w:numId w:val="1"/>
-        </w:numPr>
-      </w:pPr>
-      <w:r>
-        <w:t xml:space="preserve">(Functional </w:t>
-      </w:r>
-      <w:r>
-        <w:t>requirement</w:t>
-      </w:r>
-      <w:r>
-        <w:t>) :</w:t>
-      </w:r>
-      <w:r>
-        <w:t xml:space="preserve">The system shall mange user roles, enforce access control, and maintain system </w:t>
-      </w:r>
-      <w:r>
-        <w:t>performance</w:t>
-      </w:r>
-    </w:p>
-    <w:p>
-      <w:pPr>
-        <w:pStyle w:val="ListParagraph"/>
-        <w:numPr>
-          <w:ilvl w:val="0"/>
-          <w:numId w:val="1"/>
-        </w:numPr>
-      </w:pPr>
-    </w:p>
-    <w:p/>
     <w:p/>
     <w:p/>
     <w:sectPr>
@@ -8399,6 +10974,7 @@
   <w:style w:type="character" w:default="1" w:styleId="DefaultParagraphFont">
     <w:name w:val="Default Paragraph Font"/>
     <w:uiPriority w:val="1"/>
+    <w:semiHidden/>
     <w:unhideWhenUsed/>
   </w:style>
   <w:style w:type="table" w:default="1" w:styleId="TableNormal">

</xml_diff>